<commit_message>
Added new player rankings and added all players  with exhaustion function.
</commit_message>
<xml_diff>
--- a/World-Cup-S-Bomb/results/Summary/final_summary.docx
+++ b/World-Cup-S-Bomb/results/Summary/final_summary.docx
@@ -4855,6 +4855,18 @@
       </w:r>
     </w:p>
     <w:p>
+      <w:pPr/>
+      <w:r>
+        <w:t>Outfield ratings are computed for every player with at least 45 tournament minutes; goalkeeper ratings require at least 90 minutes. Neither cohort is filtered at 300 minutes before feature construction, model training, position-prior estimation, or team aggregation.</w:t>
+      </w:r>
+    </w:p>
+    <w:p>
+      <w:pPr/>
+      <w:r>
+        <w:t>RankingStatus is Ranked (300+ min), Ranked (180-299 min), or Coverage only (&lt;180 min). Goalkeepers additionally use GKRankingStatus with a 270-minute primary threshold.</w:t>
+      </w:r>
+    </w:p>
+    <w:p>
       <w:r>
         <w:t xml:space="preserve">The construction is in </w:t>
       </w:r>
@@ -6500,9 +6512,43 @@
       <w:r>
         <w:t>•</w:t>
         <w:tab/>
-      </w:r>
-      <w:r>
-        <w:t>Time.</w:t>
+        <w:t>Match minute.</w:t>
+      </w:r>
+    </w:p>
+    <w:p>
+      <w:pPr>
+        <w:pStyle w:val="CompactBullet"/>
+      </w:pPr>
+      <w:r>
+        <w:t>•</w:t>
+        <w:tab/>
+        <w:t>Pre-action score differential (own goals minus opponent goals).</w:t>
+      </w:r>
+    </w:p>
+    <w:p>
+      <w:pPr>
+        <w:pStyle w:val="CompactBullet"/>
+      </w:pPr>
+      <w:r>
+        <w:t>•</w:t>
+        <w:tab/>
+        <w:t>Pre-tournament opponent strength from the 6 October 2022 FIFA ranking.</w:t>
+      </w:r>
+    </w:p>
+    <w:p>
+      <w:pPr>
+        <w:pStyle w:val="CompactBullet"/>
+      </w:pPr>
+      <w:r>
+        <w:t>•</w:t>
+        <w:tab/>
+        <w:t>Game phase: group stage versus knockout.</w:t>
+      </w:r>
+    </w:p>
+    <w:p>
+      <w:pPr/>
+      <w:r>
+        <w:t>The four context variables form a challenger feature set. It is accepted only when match-disjoint development OOF performance meets the documented non-inferiority tolerances; the untouched test is opened once after that choice. This run selected the baseline feature set.</w:t>
       </w:r>
     </w:p>
     <w:p>
@@ -7045,33 +7091,27 @@
       <w:r>
         <w:t>•</w:t>
         <w:tab/>
-      </w:r>
-      <w:r>
-        <w:t>ROC-AUC: 0.9490</w:t>
-      </w:r>
-    </w:p>
-    <w:p>
-      <w:pPr>
-        <w:pStyle w:val="CompactBullet"/>
-      </w:pPr>
-      <w:r>
-        <w:t>•</w:t>
-        <w:tab/>
-      </w:r>
-      <w:r>
-        <w:t>PR-AUC: 0.0848</w:t>
-      </w:r>
-    </w:p>
-    <w:p>
-      <w:pPr>
-        <w:pStyle w:val="CompactBullet"/>
-      </w:pPr>
-      <w:r>
-        <w:t>•</w:t>
-        <w:tab/>
-      </w:r>
-      <w:r>
-        <w:t>Brier: 0.001123</w:t>
+        <w:t>ROC-AUC: 0.9522</w:t>
+      </w:r>
+    </w:p>
+    <w:p>
+      <w:pPr>
+        <w:pStyle w:val="CompactBullet"/>
+      </w:pPr>
+      <w:r>
+        <w:t>•</w:t>
+        <w:tab/>
+        <w:t>PR-AUC: 0.0842</w:t>
+      </w:r>
+    </w:p>
+    <w:p>
+      <w:pPr>
+        <w:pStyle w:val="CompactBullet"/>
+      </w:pPr>
+      <w:r>
+        <w:t>•</w:t>
+        <w:tab/>
+        <w:t>Brier: 0.001122</w:t>
       </w:r>
     </w:p>
     <w:p>
@@ -7086,33 +7126,27 @@
       <w:r>
         <w:t>•</w:t>
         <w:tab/>
-      </w:r>
-      <w:r>
-        <w:t>ROC-AUC: 0.9672</w:t>
-      </w:r>
-    </w:p>
-    <w:p>
-      <w:pPr>
-        <w:pStyle w:val="CompactBullet"/>
-      </w:pPr>
-      <w:r>
-        <w:t>•</w:t>
-        <w:tab/>
-      </w:r>
-      <w:r>
-        <w:t>PR-AUC: 0.1499</w:t>
-      </w:r>
-    </w:p>
-    <w:p>
-      <w:pPr>
-        <w:pStyle w:val="CompactBullet"/>
-      </w:pPr>
-      <w:r>
-        <w:t>•</w:t>
-        <w:tab/>
-      </w:r>
-      <w:r>
-        <w:t>Brier: 0.001494</w:t>
+        <w:t>ROC-AUC: 0.9697</w:t>
+      </w:r>
+    </w:p>
+    <w:p>
+      <w:pPr>
+        <w:pStyle w:val="CompactBullet"/>
+      </w:pPr>
+      <w:r>
+        <w:t>•</w:t>
+        <w:tab/>
+        <w:t>PR-AUC: 0.1427</w:t>
+      </w:r>
+    </w:p>
+    <w:p>
+      <w:pPr>
+        <w:pStyle w:val="CompactBullet"/>
+      </w:pPr>
+      <w:r>
+        <w:t>•</w:t>
+        <w:tab/>
+        <w:t>Brier: 0.001502</w:t>
       </w:r>
     </w:p>
     <w:p>
@@ -9178,6 +9212,22 @@
     </w:p>
     <w:p>
       <w:pPr>
+        <w:pStyle w:val="CompactBullet"/>
+      </w:pPr>
+      <w:r>
+        <w:t>•</w:t>
+        <w:tab/>
+        <w:t>xD90 percentile within the broad position group.</w:t>
+      </w:r>
+    </w:p>
+    <w:p>
+      <w:pPr/>
+      <w:r>
+        <w:t>The xD layer divides the pitch into 6 columns by 8 rows. Each interception, clearance, tackle/duel, block, pressure, recovery, or goalkeeper action receives BaseThreat(zone) multiplied by a fixed action-impact factor; the player total is converted to xD per 90.</w:t>
+      </w:r>
+    </w:p>
+    <w:p>
+      <w:pPr>
         <w:pStyle w:val="Heading3"/>
         <w:keepNext/>
       </w:pPr>
@@ -9550,19 +9600,7 @@
         <w:pStyle w:val="EquationBlock"/>
       </w:pPr>
       <w:r>
-        <w:rPr>
-          <w:rFonts w:ascii="Cambria Math" w:hAnsi="Cambria Math" w:eastAsia="Cambria Math"/>
-        </w:rPr>
-        <w:t>Completeness_i=</w:t>
-      </w:r>
-      <w:r>
-        <w:br/>
-      </w:r>
-      <w:r>
-        <w:rPr>
-          <w:rFonts w:ascii="Cambria Math" w:hAnsi="Cambria Math" w:eastAsia="Cambria Math"/>
-        </w:rPr>
-        <w:t>mu_i· Balance_i</w:t>
+        <w:t>BaseCompleteness_i = mu_i · Balance_i</w:t>
       </w:r>
     </w:p>
     <w:p>
@@ -9573,6 +9611,20 @@
     <w:p>
       <w:r>
         <w:t>This avoids awarding a perfect completeness score to someone who is uniformly average: the score requires both high top-three quality and balance.</w:t>
+      </w:r>
+    </w:p>
+    <w:p>
+      <w:pPr/>
+      <w:r>
+        <w:t>A minutes factor equals 0.50 below 90 minutes, 0.75 from 90-179, 0.90 from 180-299, and 1.00 from 300 minutes.</w:t>
+      </w:r>
+    </w:p>
+    <w:p>
+      <w:pPr>
+        <w:pStyle w:val="EquationBlock"/>
+      </w:pPr>
+      <w:r>
+        <w:t>Completeness_i = 0.60 · BaseCompleteness_i + 0.40 · MinutesFactor_i</w:t>
       </w:r>
     </w:p>
     <w:p>
@@ -10611,7 +10663,7 @@
     </w:p>
     <w:p>
       <w:r>
-        <w:t>The attention layer is disabled by default, but the current saved model summary shows that it was enabled, passed its gate, and was selected.</w:t>
+        <w:t>The optional attention layer was disabled in this canonical run, so no attention metrics are published. The interpretable role_aware_fallback remains the selected production layer.</w:t>
       </w:r>
     </w:p>
     <w:p>
@@ -11656,14 +11708,8 @@
             </w:tcMar>
           </w:tcPr>
           <w:p>
-            <w:pPr>
-              <w:spacing w:after="0" w:line="240" w:lineRule="auto"/>
-            </w:pPr>
             <w:r>
-              <w:rPr>
-                <w:sz w:val="16"/>
-              </w:rPr>
-              <w:t>0.3940</w:t>
+              <w:t>0.2513</w:t>
             </w:r>
           </w:p>
         </w:tc>
@@ -11679,14 +11725,8 @@
             </w:tcMar>
           </w:tcPr>
           <w:p>
-            <w:pPr>
-              <w:spacing w:after="0" w:line="240" w:lineRule="auto"/>
-            </w:pPr>
             <w:r>
-              <w:rPr>
-                <w:sz w:val="16"/>
-              </w:rPr>
-              <w:t>0.2014</w:t>
+              <w:t>0.1351</w:t>
             </w:r>
           </w:p>
         </w:tc>
@@ -11702,14 +11742,8 @@
             </w:tcMar>
           </w:tcPr>
           <w:p>
-            <w:pPr>
-              <w:spacing w:after="0" w:line="240" w:lineRule="auto"/>
-            </w:pPr>
             <w:r>
-              <w:rPr>
-                <w:sz w:val="16"/>
-              </w:rPr>
-              <w:t>0.8442</w:t>
+              <w:t>0.5620</w:t>
             </w:r>
           </w:p>
         </w:tc>
@@ -11755,14 +11789,8 @@
             <w:shd w:fill="F8FAFC"/>
           </w:tcPr>
           <w:p>
-            <w:pPr>
-              <w:spacing w:after="0" w:line="240" w:lineRule="auto"/>
-            </w:pPr>
             <w:r>
-              <w:rPr>
-                <w:sz w:val="16"/>
-              </w:rPr>
-              <w:t>0.1200</w:t>
+              <w:t>0.0946</w:t>
             </w:r>
           </w:p>
         </w:tc>
@@ -11779,14 +11807,8 @@
             <w:shd w:fill="F8FAFC"/>
           </w:tcPr>
           <w:p>
-            <w:pPr>
-              <w:spacing w:after="0" w:line="240" w:lineRule="auto"/>
-            </w:pPr>
             <w:r>
-              <w:rPr>
-                <w:sz w:val="16"/>
-              </w:rPr>
-              <w:t>0.0672</w:t>
+              <w:t>0.0519</w:t>
             </w:r>
           </w:p>
         </w:tc>
@@ -11803,14 +11825,8 @@
             <w:shd w:fill="F8FAFC"/>
           </w:tcPr>
           <w:p>
-            <w:pPr>
-              <w:spacing w:after="0" w:line="240" w:lineRule="auto"/>
-            </w:pPr>
             <w:r>
-              <w:rPr>
-                <w:sz w:val="16"/>
-              </w:rPr>
-              <w:t>0.3787</w:t>
+              <w:t>0.3471</w:t>
             </w:r>
           </w:p>
         </w:tc>
@@ -11916,7 +11932,7 @@
     </w:p>
     <w:p>
       <w:r>
-        <w:t>The primary VAEP component takes the stronger channel:</w:t>
+        <w:t>The primary VAEP component uses explicit functional-role weights whose offense and defense shares sum to one:</w:t>
       </w:r>
     </w:p>
     <w:p>
@@ -11924,51 +11940,12 @@
         <w:pStyle w:val="EquationBlock"/>
       </w:pPr>
       <w:r>
-        <w:rPr>
-          <w:rFonts w:ascii="Cambria Math" w:hAnsi="Cambria Math" w:eastAsia="Cambria Math"/>
-        </w:rPr>
-        <w:t>VAEPComponent_i=</w:t>
-      </w:r>
-      <w:r>
-        <w:br/>
-      </w:r>
-      <w:r>
-        <w:rPr>
-          <w:rFonts w:ascii="Cambria Math" w:hAnsi="Cambria Math" w:eastAsia="Cambria Math"/>
-        </w:rPr>
-        <w:t>max(</w:t>
-      </w:r>
-      <w:r>
-        <w:br/>
-      </w:r>
-      <w:r>
-        <w:rPr>
-          <w:rFonts w:ascii="Cambria Math" w:hAnsi="Cambria Math" w:eastAsia="Cambria Math"/>
-        </w:rPr>
-        <w:t>OffVAEPScaled_i,</w:t>
-      </w:r>
-      <w:r>
-        <w:br/>
-      </w:r>
-      <w:r>
-        <w:rPr>
-          <w:rFonts w:ascii="Cambria Math" w:hAnsi="Cambria Math" w:eastAsia="Cambria Math"/>
-        </w:rPr>
-        <w:t>DefVAEPScaled_i</w:t>
-      </w:r>
-      <w:r>
-        <w:br/>
-      </w:r>
-      <w:r>
-        <w:rPr>
-          <w:rFonts w:ascii="Cambria Math" w:hAnsi="Cambria Math" w:eastAsia="Cambria Math"/>
-        </w:rPr>
-        <w:t>)</w:t>
-      </w:r>
-    </w:p>
-    <w:p>
-      <w:r>
-        <w:t>Thus an elite defensive contributor does not have to match an attacker’s raw offensive value to receive a strong VAEP component.</w:t>
+        <w:t>VAEPComponent_i = w_off(role_i) · OffVAEPScaled_i + w_def(role_i) · DefVAEPScaled_i</w:t>
+      </w:r>
+    </w:p>
+    <w:p>
+      <w:r>
+        <w:t>Starting offense/defense weights are 0.85/0.15 for progressive wingers and forwards, 0.70/0.30 for attacking wingbacks and wide creators, 0.55/0.45 for hybrid creators, 0.35/0.65 for ball-winners, and 0.25/0.75 for center backs and defensive fullbacks.</w:t>
       </w:r>
     </w:p>
     <w:p>
@@ -11981,51 +11958,12 @@
         <w:pStyle w:val="EquationBlock"/>
       </w:pPr>
       <w:r>
-        <w:rPr>
-          <w:rFonts w:ascii="Cambria Math" w:hAnsi="Cambria Math" w:eastAsia="Cambria Math"/>
-        </w:rPr>
-        <w:t>RoleAdjustedValue_i=</w:t>
-      </w:r>
-      <w:r>
-        <w:br/>
-      </w:r>
-      <w:r>
-        <w:rPr>
-          <w:rFonts w:ascii="Cambria Math" w:hAnsi="Cambria Math" w:eastAsia="Cambria Math"/>
-        </w:rPr>
-        <w:t>max(</w:t>
-      </w:r>
-      <w:r>
-        <w:br/>
-      </w:r>
-      <w:r>
-        <w:rPr>
-          <w:rFonts w:ascii="Cambria Math" w:hAnsi="Cambria Math" w:eastAsia="Cambria Math"/>
-        </w:rPr>
-        <w:t>Scaled(OffVAEP90_i),</w:t>
-      </w:r>
-      <w:r>
-        <w:br/>
-      </w:r>
-      <w:r>
-        <w:rPr>
-          <w:rFonts w:ascii="Cambria Math" w:hAnsi="Cambria Math" w:eastAsia="Cambria Math"/>
-        </w:rPr>
-        <w:t>Scaled(DefVAEP90_i)</w:t>
-      </w:r>
-      <w:r>
-        <w:br/>
-      </w:r>
-      <w:r>
-        <w:rPr>
-          <w:rFonts w:ascii="Cambria Math" w:hAnsi="Cambria Math" w:eastAsia="Cambria Math"/>
-        </w:rPr>
-        <w:t>)</w:t>
-      </w:r>
-    </w:p>
-    <w:p>
-      <w:r>
-        <w:t>“Role-adjusted” here refers to taking the stronger independently modeled contribution channel. It does not mean that the GMM role probability is directly multiplied into the rating.</w:t>
+        <w:t>RoleAdjustedValue_i = w_off(role_i) · OffElasticNetScaled_i + w_def(role_i) · DefElasticNetScaled_i</w:t>
+      </w:r>
+    </w:p>
+    <w:p>
+      <w:r>
+        <w:t>Role labels choose the symmetric channel weights but never award points, add player-specific bonuses, or override observed metrics.</w:t>
       </w:r>
     </w:p>
     <w:p>
@@ -12181,14 +12119,8 @@
             </w:tcMar>
           </w:tcPr>
           <w:p>
-            <w:pPr>
-              <w:spacing w:after="0" w:line="240" w:lineRule="auto"/>
-            </w:pPr>
             <w:r>
-              <w:rPr>
-                <w:sz w:val="16"/>
-              </w:rPr>
-              <w:t>40%</w:t>
+              <w:t>40.0%</w:t>
             </w:r>
           </w:p>
         </w:tc>
@@ -12204,14 +12136,8 @@
             </w:tcMar>
           </w:tcPr>
           <w:p>
-            <w:pPr>
-              <w:spacing w:after="0" w:line="240" w:lineRule="auto"/>
-            </w:pPr>
             <w:r>
-              <w:rPr>
-                <w:sz w:val="16"/>
-              </w:rPr>
-              <w:t>Maximum of independently scaled OFF and DEF VAEP</w:t>
+              <w:t>Role-weighted independently scaled OFF and DEF VAEP using the development-gated baseline feature set</w:t>
             </w:r>
           </w:p>
         </w:tc>
@@ -12257,14 +12183,8 @@
             <w:shd w:fill="F8FAFC"/>
           </w:tcPr>
           <w:p>
-            <w:pPr>
-              <w:spacing w:after="0" w:line="240" w:lineRule="auto"/>
-            </w:pPr>
             <w:r>
-              <w:rPr>
-                <w:sz w:val="16"/>
-              </w:rPr>
-              <w:t>15%</w:t>
+              <w:t>15.0%</w:t>
             </w:r>
           </w:p>
         </w:tc>
@@ -12332,14 +12252,8 @@
             </w:tcMar>
           </w:tcPr>
           <w:p>
-            <w:pPr>
-              <w:spacing w:after="0" w:line="240" w:lineRule="auto"/>
-            </w:pPr>
             <w:r>
-              <w:rPr>
-                <w:sz w:val="16"/>
-              </w:rPr>
-              <w:t>15%</w:t>
+              <w:t>15.0%</w:t>
             </w:r>
           </w:p>
         </w:tc>
@@ -12408,14 +12322,8 @@
             <w:shd w:fill="F8FAFC"/>
           </w:tcPr>
           <w:p>
-            <w:pPr>
-              <w:spacing w:after="0" w:line="240" w:lineRule="auto"/>
-            </w:pPr>
             <w:r>
-              <w:rPr>
-                <w:sz w:val="16"/>
-              </w:rPr>
-              <w:t>15%</w:t>
+              <w:t>15.0%</w:t>
             </w:r>
           </w:p>
         </w:tc>
@@ -12432,14 +12340,8 @@
             <w:shd w:fill="F8FAFC"/>
           </w:tcPr>
           <w:p>
-            <w:pPr>
-              <w:spacing w:after="0" w:line="240" w:lineRule="auto"/>
-            </w:pPr>
             <w:r>
-              <w:rPr>
-                <w:sz w:val="16"/>
-              </w:rPr>
-              <w:t>Maximum of independently scaled offensive and defensive ElasticNet predictions</w:t>
+              <w:t>Role-weighted independently scaled offensive and defensive ElasticNet predictions</w:t>
             </w:r>
           </w:p>
         </w:tc>
@@ -12483,14 +12385,8 @@
             </w:tcMar>
           </w:tcPr>
           <w:p>
-            <w:pPr>
-              <w:spacing w:after="0" w:line="240" w:lineRule="auto"/>
-            </w:pPr>
             <w:r>
-              <w:rPr>
-                <w:sz w:val="16"/>
-              </w:rPr>
-              <w:t>10%</w:t>
+              <w:t>10.0%</w:t>
             </w:r>
           </w:p>
         </w:tc>
@@ -12506,14 +12402,8 @@
             </w:tcMar>
           </w:tcPr>
           <w:p>
-            <w:pPr>
-              <w:spacing w:after="0" w:line="240" w:lineRule="auto"/>
-            </w:pPr>
             <w:r>
-              <w:rPr>
-                <w:sz w:val="16"/>
-              </w:rPr>
-              <w:t>Quality-adjusted balance of top three role dimensions</w:t>
+              <w:t>60% top-three quality/balance plus 40% minutes factor</w:t>
             </w:r>
           </w:p>
         </w:tc>
@@ -12559,14 +12449,8 @@
             <w:shd w:fill="F8FAFC"/>
           </w:tcPr>
           <w:p>
-            <w:pPr>
-              <w:spacing w:after="0" w:line="240" w:lineRule="auto"/>
-            </w:pPr>
             <w:r>
-              <w:rPr>
-                <w:sz w:val="16"/>
-              </w:rPr>
-              <w:t>5%</w:t>
+              <w:t>5.0%</w:t>
             </w:r>
           </w:p>
         </w:tc>
@@ -12607,108 +12491,17 @@
       </w:r>
     </w:p>
     <w:p>
+      <w:pPr/>
+      <w:r>
+        <w:t>A positive ElasticNet tests these six components against a transparent team-importance proxy with team-disjoint GroupKFold. Learned coefficients are normalized to sum to one. The challenger is retained only if its OOF Spearman correlation is non-inferior to the incumbent. This run selected the incumbent fallback (0.7033 challenger versus 0.2152 incumbent).</w:t>
+      </w:r>
+    </w:p>
+    <w:p>
       <w:pPr>
         <w:pStyle w:val="EquationBlock"/>
       </w:pPr>
       <w:r>
-        <w:rPr>
-          <w:rFonts w:ascii="Cambria Math" w:hAnsi="Cambria Math" w:eastAsia="Cambria Math"/>
-        </w:rPr>
-        <w:t>OutfieldRaw_i=</w:t>
-      </w:r>
-      <w:r>
-        <w:br/>
-      </w:r>
-      <w:r>
-        <w:rPr>
-          <w:rFonts w:ascii="Cambria Math" w:hAnsi="Cambria Math" w:eastAsia="Cambria Math"/>
-        </w:rPr>
-        <w:t>0.40· VAEPComponent_i</w:t>
-      </w:r>
-      <w:r>
-        <w:br/>
-      </w:r>
-      <w:r>
-        <w:rPr>
-          <w:rFonts w:ascii="Cambria Math" w:hAnsi="Cambria Math" w:eastAsia="Cambria Math"/>
-        </w:rPr>
-      </w:r>
-      <w:r>
-        <w:br/>
-      </w:r>
-      <w:r>
-        <w:rPr>
-          <w:rFonts w:ascii="Cambria Math" w:hAnsi="Cambria Math" w:eastAsia="Cambria Math"/>
-        </w:rPr>
-        <w:t>+0.15· VAEPPerTouchPct_i</w:t>
-      </w:r>
-      <w:r>
-        <w:br/>
-      </w:r>
-      <w:r>
-        <w:rPr>
-          <w:rFonts w:ascii="Cambria Math" w:hAnsi="Cambria Math" w:eastAsia="Cambria Math"/>
-        </w:rPr>
-      </w:r>
-      <w:r>
-        <w:br/>
-      </w:r>
-      <w:r>
-        <w:rPr>
-          <w:rFonts w:ascii="Cambria Math" w:hAnsi="Cambria Math" w:eastAsia="Cambria Math"/>
-        </w:rPr>
-        <w:t>+0.15· xT90Pct_i</w:t>
-      </w:r>
-      <w:r>
-        <w:br/>
-      </w:r>
-      <w:r>
-        <w:rPr>
-          <w:rFonts w:ascii="Cambria Math" w:hAnsi="Cambria Math" w:eastAsia="Cambria Math"/>
-        </w:rPr>
-      </w:r>
-      <w:r>
-        <w:br/>
-      </w:r>
-      <w:r>
-        <w:rPr>
-          <w:rFonts w:ascii="Cambria Math" w:hAnsi="Cambria Math" w:eastAsia="Cambria Math"/>
-        </w:rPr>
-        <w:t>+0.15· RoleAdjustedValue_i</w:t>
-      </w:r>
-      <w:r>
-        <w:br/>
-      </w:r>
-      <w:r>
-        <w:rPr>
-          <w:rFonts w:ascii="Cambria Math" w:hAnsi="Cambria Math" w:eastAsia="Cambria Math"/>
-        </w:rPr>
-      </w:r>
-      <w:r>
-        <w:br/>
-      </w:r>
-      <w:r>
-        <w:rPr>
-          <w:rFonts w:ascii="Cambria Math" w:hAnsi="Cambria Math" w:eastAsia="Cambria Math"/>
-        </w:rPr>
-        <w:t>+0.10· Completeness_i</w:t>
-      </w:r>
-      <w:r>
-        <w:br/>
-      </w:r>
-      <w:r>
-        <w:rPr>
-          <w:rFonts w:ascii="Cambria Math" w:hAnsi="Cambria Math" w:eastAsia="Cambria Math"/>
-        </w:rPr>
-      </w:r>
-      <w:r>
-        <w:br/>
-      </w:r>
-      <w:r>
-        <w:rPr>
-          <w:rFonts w:ascii="Cambria Math" w:hAnsi="Cambria Math" w:eastAsia="Cambria Math"/>
-        </w:rPr>
-        <w:t>+0.05· OffBall_i</w:t>
+        <w:t>OutfieldRaw_i = 0.4000 · VAEPComponent_i + 0.1500 · VAEPPerTouchPct_i + 0.1500 · xT90Pct_i + 0.1500 · RoleAdjustedValue_i + 0.1000 · Completeness_i + 0.0500 · OffBall_i</w:t>
       </w:r>
     </w:p>
     <w:p>
@@ -12780,19 +12573,7 @@
         <w:pStyle w:val="EquationBlock"/>
       </w:pPr>
       <w:r>
-        <w:rPr>
-          <w:rFonts w:ascii="Cambria Math" w:hAnsi="Cambria Math" w:eastAsia="Cambria Math"/>
-        </w:rPr>
-        <w:t>MinutesReliability_i=</w:t>
-      </w:r>
-      <w:r>
-        <w:br/>
-      </w:r>
-      <w:r>
-        <w:rPr>
-          <w:rFonts w:ascii="Cambria Math" w:hAnsi="Cambria Math" w:eastAsia="Cambria Math"/>
-        </w:rPr>
-        <w:t>(Minutes_i)/(Minutes_i+300)</w:t>
+        <w:t>MinutesReliability_i = Minutes_i / (Minutes_i + 450)</w:t>
       </w:r>
     </w:p>
     <w:p>
@@ -12840,7 +12621,7 @@
     </w:p>
     <w:p>
       <w:r>
-        <w:t>Only players with at least 300 tournament minutes enter the published rankings.</w:t>
+        <w:t>Ratings and team aggregates include the full 45-minute eligible outfield cohort. The 300-minute cutoff only defines the primary high-reliability table; lower-minute players retain ratings and explicit RankingStatus labels.</w:t>
       </w:r>
     </w:p>
     <w:p>
@@ -13718,6 +13499,28 @@
     </w:p>
     <w:p>
       <w:pPr>
+        <w:pStyle w:val="Heading3"/>
+      </w:pPr>
+      <w:r>
+        <w:t>32.7 High-leverage saves</w:t>
+      </w:r>
+    </w:p>
+    <w:p>
+      <w:pPr/>
+      <w:r>
+        <w:t>A high-leverage shot is a non-shootout shot on target with StatsBomb shot xG greater than 0.30.</w:t>
+      </w:r>
+    </w:p>
+    <w:p>
+      <w:pPr>
+        <w:pStyle w:val="EquationBlock"/>
+      </w:pPr>
+      <w:r>
+        <w:t>HighLeverageSavePct_i = Saves_i(xG &gt; 0.30) / ShotsOnTargetFaced_i(xG &gt; 0.30)</w:t>
+      </w:r>
+    </w:p>
+    <w:p>
+      <w:pPr>
         <w:spacing w:before="60" w:after="60"/>
         <w:pBdr>
           <w:bottom w:val="single" w:sz="8" w:space="7" w:color="DDE5ED"/>
@@ -13735,7 +13538,7 @@
     </w:p>
     <w:p>
       <w:r>
-        <w:t>The six equally weighted components are:</w:t>
+        <w:t>The seven weighted components are:</w:t>
       </w:r>
     </w:p>
     <w:p>
@@ -13745,9 +13548,7 @@
       <w:r>
         <w:t>1.</w:t>
         <w:tab/>
-      </w:r>
-      <w:r>
-        <w:t>Goals prevented proxy per 90.</w:t>
+        <w:t>Goals prevented proxy per 90: 22.5%.</w:t>
       </w:r>
     </w:p>
     <w:p>
@@ -13757,9 +13558,7 @@
       <w:r>
         <w:t>2.</w:t>
         <w:tab/>
-      </w:r>
-      <w:r>
-        <w:t>Save rate.</w:t>
+        <w:t>Save rate: 13.5%.</w:t>
       </w:r>
     </w:p>
     <w:p>
@@ -13769,9 +13568,7 @@
       <w:r>
         <w:t>3.</w:t>
         <w:tab/>
-      </w:r>
-      <w:r>
-        <w:t>Cross-stopping rate.</w:t>
+        <w:t>Cross-stopping rate: 13.5%.</w:t>
       </w:r>
     </w:p>
     <w:p>
@@ -13781,9 +13578,7 @@
       <w:r>
         <w:t>4.</w:t>
         <w:tab/>
-      </w:r>
-      <w:r>
-        <w:t>Sweeper actions per 90.</w:t>
+        <w:t>Sweeper actions per 90: 13.5%.</w:t>
       </w:r>
     </w:p>
     <w:p>
@@ -13793,9 +13588,7 @@
       <w:r>
         <w:t>5.</w:t>
         <w:tab/>
-      </w:r>
-      <w:r>
-        <w:t>Distribution under pressure.</w:t>
+        <w:t>Distribution under pressure: 13.5%.</w:t>
       </w:r>
     </w:p>
     <w:p>
@@ -13805,9 +13598,17 @@
       <w:r>
         <w:t>6.</w:t>
         <w:tab/>
-      </w:r>
-      <w:r>
-        <w:t>Shrunk penalty save rate.</w:t>
+        <w:t>Shrunk penalty save rate: 13.5%.</w:t>
+      </w:r>
+    </w:p>
+    <w:p>
+      <w:pPr>
+        <w:pStyle w:val="CompactNumber"/>
+      </w:pPr>
+      <w:r>
+        <w:t>7.</w:t>
+        <w:tab/>
+        <w:t>High-leverage save percentage: 10.0%.</w:t>
       </w:r>
     </w:p>
     <w:p>
@@ -13820,28 +13621,7 @@
         <w:pStyle w:val="EquationBlock"/>
       </w:pPr>
       <w:r>
-        <w:rPr>
-          <w:rFonts w:ascii="Cambria Math" w:hAnsi="Cambria Math" w:eastAsia="Cambria Math"/>
-        </w:rPr>
-        <w:t>GKRaw_i=</w:t>
-      </w:r>
-      <w:r>
-        <w:br/>
-      </w:r>
-      <w:r>
-        <w:rPr>
-          <w:rFonts w:ascii="Cambria Math" w:hAnsi="Cambria Math" w:eastAsia="Cambria Math"/>
-        </w:rPr>
-        <w:t>(1)/(M_i)</w:t>
-      </w:r>
-      <w:r>
-        <w:br/>
-      </w:r>
-      <w:r>
-        <w:rPr>
-          <w:rFonts w:ascii="Cambria Math" w:hAnsi="Cambria Math" w:eastAsia="Cambria Math"/>
-        </w:rPr>
-        <w:t>∑_m∈ availablePercentile_m,i</w:t>
+        <w:t>GKRaw_i = sum_m available(w_m · Percentile_m,i) / sum_m available(w_m)</w:t>
       </w:r>
     </w:p>
     <w:p>
@@ -13854,10 +13634,7 @@
         <w:pStyle w:val="EquationBlock"/>
       </w:pPr>
       <w:r>
-        <w:rPr>
-          <w:rFonts w:ascii="Cambria Math" w:hAnsi="Cambria Math" w:eastAsia="Cambria Math"/>
-        </w:rPr>
-        <w:t>GKCoverage_i=(M_i)/(6)</w:t>
+        <w:t>GKCoverage_i = M_i / 7</w:t>
       </w:r>
     </w:p>
     <w:p>
@@ -13870,37 +13647,7 @@
         <w:pStyle w:val="EquationBlock"/>
       </w:pPr>
       <w:r>
-        <w:rPr>
-          <w:rFonts w:ascii="Cambria Math" w:hAnsi="Cambria Math" w:eastAsia="Cambria Math"/>
-        </w:rPr>
-        <w:t>GKReliability_i=</w:t>
-      </w:r>
-      <w:r>
-        <w:br/>
-      </w:r>
-      <w:r>
-        <w:rPr>
-          <w:rFonts w:ascii="Cambria Math" w:hAnsi="Cambria Math" w:eastAsia="Cambria Math"/>
-        </w:rPr>
-        <w:t>GKCoverage_i</w:t>
-      </w:r>
-      <w:r>
-        <w:br/>
-      </w:r>
-      <w:r>
-        <w:rPr>
-          <w:rFonts w:ascii="Cambria Math" w:hAnsi="Cambria Math" w:eastAsia="Cambria Math"/>
-        </w:rPr>
-        <w:t>·</w:t>
-      </w:r>
-      <w:r>
-        <w:br/>
-      </w:r>
-      <w:r>
-        <w:rPr>
-          <w:rFonts w:ascii="Cambria Math" w:hAnsi="Cambria Math" w:eastAsia="Cambria Math"/>
-        </w:rPr>
-        <w:t>(Minutes_i)/(Minutes_i+300)</w:t>
+        <w:t>GKReliability_i = GKCoverage_i · Minutes_i / (Minutes_i + 450)</w:t>
       </w:r>
     </w:p>
     <w:p>
@@ -14014,6 +13761,12 @@
       </w:hyperlink>
       <w:r>
         <w:t>.</w:t>
+      </w:r>
+    </w:p>
+    <w:p>
+      <w:pPr/>
+      <w:r>
+        <w:t>GKFinal is computed for all goalkeepers with at least 90 minutes. GKRankingStatus is Ranked (270+ min), Ranked (180-269 min), or Coverage only (&lt;180 min). Missing components reduce coverage and are never converted to zero.</w:t>
       </w:r>
     </w:p>
     <w:p>
@@ -16256,6 +16009,192 @@
           </w:p>
         </w:tc>
       </w:tr>
+      <w:tr>
+        <w:tc>
+          <w:tcPr>
+            <w:tcW w:type="dxa" w:w="1584"/>
+          </w:tcPr>
+          <w:p>
+            <w:r>
+              <w:t>Pre-action score/time/opponent/phase</w:t>
+            </w:r>
+          </w:p>
+        </w:tc>
+        <w:tc>
+          <w:tcPr>
+            <w:tcW w:type="dxa" w:w="1584"/>
+          </w:tcPr>
+          <w:p>
+            <w:r>
+              <w:t>OOF challenger rejected</w:t>
+            </w:r>
+          </w:p>
+        </w:tc>
+        <w:tc>
+          <w:tcPr>
+            <w:tcW w:type="dxa" w:w="1584"/>
+          </w:tcPr>
+          <w:p>
+            <w:r>
+              <w:t>Indirect</w:t>
+            </w:r>
+          </w:p>
+        </w:tc>
+        <w:tc>
+          <w:tcPr>
+            <w:tcW w:type="dxa" w:w="1584"/>
+          </w:tcPr>
+          <w:p>
+            <w:r>
+              <w:t>No</w:t>
+            </w:r>
+          </w:p>
+        </w:tc>
+        <w:tc>
+          <w:tcPr>
+            <w:tcW w:type="dxa" w:w="1584"/>
+          </w:tcPr>
+          <w:p>
+            <w:r>
+              <w:t>No</w:t>
+            </w:r>
+          </w:p>
+        </w:tc>
+        <w:tc>
+          <w:tcPr>
+            <w:tcW w:type="dxa" w:w="1584"/>
+          </w:tcPr>
+          <w:p>
+            <w:r>
+              <w:t>No</w:t>
+            </w:r>
+          </w:p>
+        </w:tc>
+      </w:tr>
+      <w:tr>
+        <w:tc>
+          <w:tcPr>
+            <w:tcW w:type="dxa" w:w="1584"/>
+          </w:tcPr>
+          <w:p>
+            <w:r>
+              <w:t>xD spatial disruption</w:t>
+            </w:r>
+          </w:p>
+        </w:tc>
+        <w:tc>
+          <w:tcPr>
+            <w:tcW w:type="dxa" w:w="1584"/>
+          </w:tcPr>
+          <w:p>
+            <w:r>
+              <w:t>Defensive channel</w:t>
+            </w:r>
+          </w:p>
+        </w:tc>
+        <w:tc>
+          <w:tcPr>
+            <w:tcW w:type="dxa" w:w="1584"/>
+          </w:tcPr>
+          <w:p>
+            <w:r>
+              <w:t>Defensive inputs</w:t>
+            </w:r>
+          </w:p>
+        </w:tc>
+        <w:tc>
+          <w:tcPr>
+            <w:tcW w:type="dxa" w:w="1584"/>
+          </w:tcPr>
+          <w:p>
+            <w:r>
+              <w:t>Defending</w:t>
+            </w:r>
+          </w:p>
+        </w:tc>
+        <w:tc>
+          <w:tcPr>
+            <w:tcW w:type="dxa" w:w="1584"/>
+          </w:tcPr>
+          <w:p>
+            <w:r>
+              <w:t>No</w:t>
+            </w:r>
+          </w:p>
+        </w:tc>
+        <w:tc>
+          <w:tcPr>
+            <w:tcW w:type="dxa" w:w="1584"/>
+          </w:tcPr>
+          <w:p>
+            <w:r>
+              <w:t>No</w:t>
+            </w:r>
+          </w:p>
+        </w:tc>
+      </w:tr>
+      <w:tr>
+        <w:tc>
+          <w:tcPr>
+            <w:tcW w:type="dxa" w:w="1584"/>
+          </w:tcPr>
+          <w:p>
+            <w:r>
+              <w:t>High-leverage saves</w:t>
+            </w:r>
+          </w:p>
+        </w:tc>
+        <w:tc>
+          <w:tcPr>
+            <w:tcW w:type="dxa" w:w="1584"/>
+          </w:tcPr>
+          <w:p>
+            <w:r>
+              <w:t>No</w:t>
+            </w:r>
+          </w:p>
+        </w:tc>
+        <w:tc>
+          <w:tcPr>
+            <w:tcW w:type="dxa" w:w="1584"/>
+          </w:tcPr>
+          <w:p>
+            <w:r>
+              <w:t>No</w:t>
+            </w:r>
+          </w:p>
+        </w:tc>
+        <w:tc>
+          <w:tcPr>
+            <w:tcW w:type="dxa" w:w="1584"/>
+          </w:tcPr>
+          <w:p>
+            <w:r>
+              <w:t>No</w:t>
+            </w:r>
+          </w:p>
+        </w:tc>
+        <w:tc>
+          <w:tcPr>
+            <w:tcW w:type="dxa" w:w="1584"/>
+          </w:tcPr>
+          <w:p>
+            <w:r>
+              <w:t>No</w:t>
+            </w:r>
+          </w:p>
+        </w:tc>
+        <w:tc>
+          <w:tcPr>
+            <w:tcW w:type="dxa" w:w="1584"/>
+          </w:tcPr>
+          <w:p>
+            <w:r>
+              <w:t>10% GKRaw</w:t>
+            </w:r>
+          </w:p>
+        </w:tc>
+      </w:tr>
     </w:tbl>
     <w:p>
       <w:pPr>
@@ -16264,7 +16203,7 @@
     </w:p>
     <w:p>
       <w:r>
-        <w:t>The most important distinction is that many columns in the final CSV are explanatory or role-discovery variables. Only the six outfield components or six goalkeeper components directly determine the published ratings.</w:t>
+        <w:t>The most important distinction is that many final-CSV columns are explanatory or role-discovery variables. Only the six calibrated outfield components directly determine OutfieldRaw; xD affects the defensive role dimension. Seven weighted goalkeeper components determine GKRaw. Reliability shrinkage and missing-feature coverage then determine the published final scores.</w:t>
       </w:r>
     </w:p>
     <w:p>
@@ -16384,7 +16323,7 @@
     </w:p>
     <w:p>
       <w:r>
-        <w:t>The final hierarchy is best understood as a tournament-sample evaluation: it combines sophisticated match-disjoint action modeling with several descriptive, percentile-based layers. It is leakage-conscious, but the equal-weight role dimensions, limited 360 coverage, weak defensive ElasticNet correlation, event-derived goalkeeper PSxG proxy, and within-tournament reference distributions mean it should not be interpreted as a universal measure of permanent player ability.</w:t>
+        <w:t>The final hierarchy is a tournament-sample evaluation. It preserves match-disjoint action modeling, explicitly tests calibration changes against a non-inferiority gate, and publishes coverage/reliability statuses. Limited 360 coverage, the event-derived post-shot proxy, within-tournament percentiles, and the weak defensive ElasticNet head still prevent interpretation as permanent player ability.</w:t>
       </w:r>
     </w:p>
     <w:sectPr>

</xml_diff>

<commit_message>
fix: fixed low sample size gk ratings
</commit_message>
<xml_diff>
--- a/World-Cup-S-Bomb/results/Summary/final_summary.docx
+++ b/World-Cup-S-Bomb/results/Summary/final_summary.docx
@@ -6314,7 +6314,7 @@
                 <w:b w:val="0"/>
                 <w:sz w:val="15"/>
               </w:rPr>
-              <w:t>0.3854</w:t>
+              <w:t>0.3785</w:t>
             </w:r>
           </w:p>
         </w:tc>
@@ -6501,7 +6501,7 @@
                 <w:b w:val="0"/>
                 <w:sz w:val="15"/>
               </w:rPr>
-              <w:t>0.2899</w:t>
+              <w:t>0.2807</w:t>
             </w:r>
           </w:p>
         </w:tc>
@@ -6688,7 +6688,7 @@
                 <w:b w:val="0"/>
                 <w:sz w:val="15"/>
               </w:rPr>
-              <w:t>0.2879</w:t>
+              <w:t>0.2793</w:t>
             </w:r>
           </w:p>
         </w:tc>
@@ -6875,7 +6875,7 @@
                 <w:b w:val="0"/>
                 <w:sz w:val="15"/>
               </w:rPr>
-              <w:t>0.2856</w:t>
+              <w:t>0.2776</w:t>
             </w:r>
           </w:p>
         </w:tc>
@@ -7062,7 +7062,7 @@
                 <w:b w:val="0"/>
                 <w:sz w:val="15"/>
               </w:rPr>
-              <w:t>0.2536</w:t>
+              <w:t>0.2458</w:t>
             </w:r>
           </w:p>
         </w:tc>
@@ -7249,7 +7249,7 @@
                 <w:b w:val="0"/>
                 <w:sz w:val="15"/>
               </w:rPr>
-              <w:t>0.2525</w:t>
+              <w:t>0.2445</w:t>
             </w:r>
           </w:p>
         </w:tc>
@@ -7436,7 +7436,7 @@
                 <w:b w:val="0"/>
                 <w:sz w:val="15"/>
               </w:rPr>
-              <w:t>0.2477</w:t>
+              <w:t>0.2399</w:t>
             </w:r>
           </w:p>
         </w:tc>
@@ -7623,7 +7623,7 @@
                 <w:b w:val="0"/>
                 <w:sz w:val="15"/>
               </w:rPr>
-              <w:t>0.2352</w:t>
+              <w:t>0.2259</w:t>
             </w:r>
           </w:p>
         </w:tc>
@@ -7810,7 +7810,7 @@
                 <w:b w:val="0"/>
                 <w:sz w:val="15"/>
               </w:rPr>
-              <w:t>0.2181</w:t>
+              <w:t>0.2099</w:t>
             </w:r>
           </w:p>
         </w:tc>
@@ -7997,7 +7997,7 @@
                 <w:b w:val="0"/>
                 <w:sz w:val="15"/>
               </w:rPr>
-              <w:t>0.2011</w:t>
+              <w:t>0.1934</w:t>
             </w:r>
           </w:p>
         </w:tc>
@@ -8184,7 +8184,7 @@
                 <w:b w:val="0"/>
                 <w:sz w:val="15"/>
               </w:rPr>
-              <w:t>0.1595</w:t>
+              <w:t>0.1514</w:t>
             </w:r>
           </w:p>
         </w:tc>
@@ -8371,7 +8371,7 @@
                 <w:b w:val="0"/>
                 <w:sz w:val="15"/>
               </w:rPr>
-              <w:t>0.1488</w:t>
+              <w:t>0.1416</w:t>
             </w:r>
           </w:p>
         </w:tc>
@@ -8506,7 +8506,7 @@
                 <w:b w:val="0"/>
                 <w:sz w:val="15"/>
               </w:rPr>
-              <w:t>Vanja Milinković Savić</w:t>
+              <w:t>Unai Simón Mendibil</w:t>
             </w:r>
           </w:p>
         </w:tc>
@@ -8532,7 +8532,7 @@
                 <w:b w:val="0"/>
                 <w:sz w:val="15"/>
               </w:rPr>
-              <w:t>Serbia</w:t>
+              <w:t>Spain</w:t>
             </w:r>
           </w:p>
         </w:tc>
@@ -8558,7 +8558,7 @@
                 <w:b w:val="0"/>
                 <w:sz w:val="15"/>
               </w:rPr>
-              <w:t>0.1053</w:t>
+              <w:t>0.1364</w:t>
             </w:r>
           </w:p>
         </w:tc>
@@ -8584,7 +8584,7 @@
                 <w:b w:val="0"/>
                 <w:sz w:val="15"/>
               </w:rPr>
-              <w:t>0.0163</w:t>
+              <w:t>-0.0209</w:t>
             </w:r>
           </w:p>
         </w:tc>
@@ -8610,7 +8610,7 @@
                 <w:b w:val="0"/>
                 <w:sz w:val="15"/>
               </w:rPr>
-              <w:t>0.0516</w:t>
+              <w:t>0.0489</w:t>
             </w:r>
           </w:p>
         </w:tc>
@@ -8636,7 +8636,7 @@
                 <w:b w:val="0"/>
                 <w:sz w:val="15"/>
               </w:rPr>
-              <w:t>0.0000</w:t>
+              <w:t>0.0497</w:t>
             </w:r>
           </w:p>
         </w:tc>
@@ -8693,7 +8693,7 @@
                 <w:b w:val="0"/>
                 <w:sz w:val="15"/>
               </w:rPr>
-              <w:t>Thibaut Courtois</w:t>
+              <w:t>Vanja Milinković Savić</w:t>
             </w:r>
           </w:p>
         </w:tc>
@@ -8719,7 +8719,7 @@
                 <w:b w:val="0"/>
                 <w:sz w:val="15"/>
               </w:rPr>
-              <w:t>Belgium</w:t>
+              <w:t>Serbia</w:t>
             </w:r>
           </w:p>
         </w:tc>
@@ -8745,7 +8745,7 @@
                 <w:b w:val="0"/>
                 <w:sz w:val="15"/>
               </w:rPr>
-              <w:t>0.1002</w:t>
+              <w:t>0.0965</w:t>
             </w:r>
           </w:p>
         </w:tc>
@@ -8771,7 +8771,7 @@
                 <w:b w:val="0"/>
                 <w:sz w:val="15"/>
               </w:rPr>
-              <w:t>0.0148</w:t>
+              <w:t>0.0163</w:t>
             </w:r>
           </w:p>
         </w:tc>
@@ -8797,7 +8797,7 @@
                 <w:b w:val="0"/>
                 <w:sz w:val="15"/>
               </w:rPr>
-              <w:t>0.0438</w:t>
+              <w:t>0.0516</w:t>
             </w:r>
           </w:p>
         </w:tc>
@@ -8880,7 +8880,7 @@
                 <w:b w:val="0"/>
                 <w:sz w:val="15"/>
               </w:rPr>
-              <w:t>Unai Simón Mendibil</w:t>
+              <w:t>Alisson Ramsés Becker</w:t>
             </w:r>
           </w:p>
         </w:tc>
@@ -8906,7 +8906,7 @@
                 <w:b w:val="0"/>
                 <w:sz w:val="15"/>
               </w:rPr>
-              <w:t>Spain</w:t>
+              <w:t>Brazil</w:t>
             </w:r>
           </w:p>
         </w:tc>
@@ -8932,7 +8932,7 @@
                 <w:b w:val="0"/>
                 <w:sz w:val="15"/>
               </w:rPr>
-              <w:t>0.0911</w:t>
+              <w:t>0.0928</w:t>
             </w:r>
           </w:p>
         </w:tc>
@@ -8958,7 +8958,7 @@
                 <w:b w:val="0"/>
                 <w:sz w:val="15"/>
               </w:rPr>
-              <w:t>-0.0209</w:t>
+              <w:t>-0.0427</w:t>
             </w:r>
           </w:p>
         </w:tc>
@@ -8984,7 +8984,7 @@
                 <w:b w:val="0"/>
                 <w:sz w:val="15"/>
               </w:rPr>
-              <w:t>0.0489</w:t>
+              <w:t>0.0060</w:t>
             </w:r>
           </w:p>
         </w:tc>
@@ -9010,7 +9010,7 @@
                 <w:b w:val="0"/>
                 <w:sz w:val="15"/>
               </w:rPr>
-              <w:t>0.0497</w:t>
+              <w:t>0.0000</w:t>
             </w:r>
           </w:p>
         </w:tc>
@@ -9067,7 +9067,7 @@
                 <w:b w:val="0"/>
                 <w:sz w:val="15"/>
               </w:rPr>
-              <w:t>Lawrence Ati-Zigi</w:t>
+              <w:t>Thibaut Courtois</w:t>
             </w:r>
           </w:p>
         </w:tc>
@@ -9093,7 +9093,7 @@
                 <w:b w:val="0"/>
                 <w:sz w:val="15"/>
               </w:rPr>
-              <w:t>Ghana</w:t>
+              <w:t>Belgium</w:t>
             </w:r>
           </w:p>
         </w:tc>
@@ -9119,7 +9119,7 @@
                 <w:b w:val="0"/>
                 <w:sz w:val="15"/>
               </w:rPr>
-              <w:t>0.0857</w:t>
+              <w:t>0.0914</w:t>
             </w:r>
           </w:p>
         </w:tc>
@@ -9145,7 +9145,7 @@
                 <w:b w:val="0"/>
                 <w:sz w:val="15"/>
               </w:rPr>
-              <w:t>-0.0376</w:t>
+              <w:t>0.0148</w:t>
             </w:r>
           </w:p>
         </w:tc>
@@ -9171,7 +9171,7 @@
                 <w:b w:val="0"/>
                 <w:sz w:val="15"/>
               </w:rPr>
-              <w:t>0.1477</w:t>
+              <w:t>0.0438</w:t>
             </w:r>
           </w:p>
         </w:tc>
@@ -9254,7 +9254,7 @@
                 <w:b w:val="0"/>
                 <w:sz w:val="15"/>
               </w:rPr>
-              <w:t>Sergio Rochet Álvarez</w:t>
+              <w:t>Lawrence Ati-Zigi</w:t>
             </w:r>
           </w:p>
         </w:tc>
@@ -9280,7 +9280,7 @@
                 <w:b w:val="0"/>
                 <w:sz w:val="15"/>
               </w:rPr>
-              <w:t>Uruguay</w:t>
+              <w:t>Ghana</w:t>
             </w:r>
           </w:p>
         </w:tc>
@@ -9306,7 +9306,7 @@
                 <w:b w:val="0"/>
                 <w:sz w:val="15"/>
               </w:rPr>
-              <w:t>0.0810</w:t>
+              <w:t>0.0766</w:t>
             </w:r>
           </w:p>
         </w:tc>
@@ -9332,7 +9332,7 @@
                 <w:b w:val="0"/>
                 <w:sz w:val="15"/>
               </w:rPr>
-              <w:t>-0.0025</w:t>
+              <w:t>-0.0376</w:t>
             </w:r>
           </w:p>
         </w:tc>
@@ -9358,7 +9358,7 @@
                 <w:b w:val="0"/>
                 <w:sz w:val="15"/>
               </w:rPr>
-              <w:t>0.0083</w:t>
+              <w:t>0.1477</w:t>
             </w:r>
           </w:p>
         </w:tc>
@@ -9441,7 +9441,7 @@
                 <w:b w:val="0"/>
                 <w:sz w:val="15"/>
               </w:rPr>
-              <w:t>Seyed Hossein Hosseini</w:t>
+              <w:t>Sergio Rochet Álvarez</w:t>
             </w:r>
           </w:p>
         </w:tc>
@@ -9467,7 +9467,7 @@
                 <w:b w:val="0"/>
                 <w:sz w:val="15"/>
               </w:rPr>
-              <w:t>Iran</w:t>
+              <w:t>Uruguay</w:t>
             </w:r>
           </w:p>
         </w:tc>
@@ -9493,7 +9493,7 @@
                 <w:b w:val="0"/>
                 <w:sz w:val="15"/>
               </w:rPr>
-              <w:t>0.0667</w:t>
+              <w:t>0.0718</w:t>
             </w:r>
           </w:p>
         </w:tc>
@@ -9519,7 +9519,7 @@
                 <w:b w:val="0"/>
                 <w:sz w:val="15"/>
               </w:rPr>
-              <w:t>-0.0288</w:t>
+              <w:t>-0.0025</w:t>
             </w:r>
           </w:p>
         </w:tc>
@@ -9545,7 +9545,7 @@
                 <w:b w:val="0"/>
                 <w:sz w:val="15"/>
               </w:rPr>
-              <w:t>0.0175</w:t>
+              <w:t>0.0083</w:t>
             </w:r>
           </w:p>
         </w:tc>
@@ -9628,7 +9628,7 @@
                 <w:b w:val="0"/>
                 <w:sz w:val="15"/>
               </w:rPr>
-              <w:t>Manuel Neuer</w:t>
+              <w:t>Jordan Pickford</w:t>
             </w:r>
           </w:p>
         </w:tc>
@@ -9654,7 +9654,7 @@
                 <w:b w:val="0"/>
                 <w:sz w:val="15"/>
               </w:rPr>
-              <w:t>Germany</w:t>
+              <w:t>England</w:t>
             </w:r>
           </w:p>
         </w:tc>
@@ -9680,7 +9680,7 @@
                 <w:b w:val="0"/>
                 <w:sz w:val="15"/>
               </w:rPr>
-              <w:t>0.0594</w:t>
+              <w:t>0.0659</w:t>
             </w:r>
           </w:p>
         </w:tc>
@@ -9706,7 +9706,7 @@
                 <w:b w:val="0"/>
                 <w:sz w:val="15"/>
               </w:rPr>
-              <w:t>-0.0084</w:t>
+              <w:t>-0.0368</w:t>
             </w:r>
           </w:p>
         </w:tc>
@@ -9732,7 +9732,7 @@
                 <w:b w:val="0"/>
                 <w:sz w:val="15"/>
               </w:rPr>
-              <w:t>0.0000</w:t>
+              <w:t>0.1472</w:t>
             </w:r>
           </w:p>
         </w:tc>
@@ -9815,7 +9815,7 @@
                 <w:b w:val="0"/>
                 <w:sz w:val="15"/>
               </w:rPr>
-              <w:t>Kasper Schmeichel</w:t>
+              <w:t>Seyed Hossein Hosseini</w:t>
             </w:r>
           </w:p>
         </w:tc>
@@ -9841,7 +9841,7 @@
                 <w:b w:val="0"/>
                 <w:sz w:val="15"/>
               </w:rPr>
-              <w:t>Denmark</w:t>
+              <w:t>Iran</w:t>
             </w:r>
           </w:p>
         </w:tc>
@@ -9867,7 +9867,7 @@
                 <w:b w:val="0"/>
                 <w:sz w:val="15"/>
               </w:rPr>
-              <w:t>0.0585</w:t>
+              <w:t>0.0586</w:t>
             </w:r>
           </w:p>
         </w:tc>
@@ -9893,7 +9893,7 @@
                 <w:b w:val="0"/>
                 <w:sz w:val="15"/>
               </w:rPr>
-              <w:t>-0.0125</w:t>
+              <w:t>-0.0288</w:t>
             </w:r>
           </w:p>
         </w:tc>
@@ -9919,7 +9919,7 @@
                 <w:b w:val="0"/>
                 <w:sz w:val="15"/>
               </w:rPr>
-              <w:t>0.0002</w:t>
+              <w:t>0.0175</w:t>
             </w:r>
           </w:p>
         </w:tc>
@@ -10002,7 +10002,7 @@
                 <w:b w:val="0"/>
                 <w:sz w:val="15"/>
               </w:rPr>
-              <w:t>Jordan Pickford</w:t>
+              <w:t>Manuel Neuer</w:t>
             </w:r>
           </w:p>
         </w:tc>
@@ -10028,7 +10028,7 @@
                 <w:b w:val="0"/>
                 <w:sz w:val="15"/>
               </w:rPr>
-              <w:t>England</w:t>
+              <w:t>Germany</w:t>
             </w:r>
           </w:p>
         </w:tc>
@@ -10054,7 +10054,7 @@
                 <w:b w:val="0"/>
                 <w:sz w:val="15"/>
               </w:rPr>
-              <w:t>0.0492</w:t>
+              <w:t>0.0499</w:t>
             </w:r>
           </w:p>
         </w:tc>
@@ -10080,7 +10080,7 @@
                 <w:b w:val="0"/>
                 <w:sz w:val="15"/>
               </w:rPr>
-              <w:t>-0.0368</w:t>
+              <w:t>-0.0084</w:t>
             </w:r>
           </w:p>
         </w:tc>
@@ -10106,7 +10106,7 @@
                 <w:b w:val="0"/>
                 <w:sz w:val="15"/>
               </w:rPr>
-              <w:t>0.1472</w:t>
+              <w:t>0.0000</w:t>
             </w:r>
           </w:p>
         </w:tc>
@@ -10189,7 +10189,7 @@
                 <w:b w:val="0"/>
                 <w:sz w:val="15"/>
               </w:rPr>
-              <w:t>Meshaal Aissa Barsham</w:t>
+              <w:t>Kasper Schmeichel</w:t>
             </w:r>
           </w:p>
         </w:tc>
@@ -10215,7 +10215,7 @@
                 <w:b w:val="0"/>
                 <w:sz w:val="15"/>
               </w:rPr>
-              <w:t>Qatar</w:t>
+              <w:t>Denmark</w:t>
             </w:r>
           </w:p>
         </w:tc>
@@ -10241,7 +10241,7 @@
                 <w:b w:val="0"/>
                 <w:sz w:val="15"/>
               </w:rPr>
-              <w:t>0.0440</w:t>
+              <w:t>0.0491</w:t>
             </w:r>
           </w:p>
         </w:tc>
@@ -10267,7 +10267,7 @@
                 <w:b w:val="0"/>
                 <w:sz w:val="15"/>
               </w:rPr>
-              <w:t>-0.0467</w:t>
+              <w:t>-0.0125</w:t>
             </w:r>
           </w:p>
         </w:tc>
@@ -10293,7 +10293,7 @@
                 <w:b w:val="0"/>
                 <w:sz w:val="15"/>
               </w:rPr>
-              <w:t>0.0000</w:t>
+              <w:t>0.0002</w:t>
             </w:r>
           </w:p>
         </w:tc>
@@ -10376,7 +10376,7 @@
                 <w:b w:val="0"/>
                 <w:sz w:val="15"/>
               </w:rPr>
-              <w:t>Hernán Ismael Galíndez</w:t>
+              <w:t>Meshaal Aissa Barsham</w:t>
             </w:r>
           </w:p>
         </w:tc>
@@ -10402,7 +10402,7 @@
                 <w:b w:val="0"/>
                 <w:sz w:val="15"/>
               </w:rPr>
-              <w:t>Ecuador</w:t>
+              <w:t>Qatar</w:t>
             </w:r>
           </w:p>
         </w:tc>
@@ -10428,7 +10428,7 @@
                 <w:b w:val="0"/>
                 <w:sz w:val="15"/>
               </w:rPr>
-              <w:t>0.0418</w:t>
+              <w:t>0.0356</w:t>
             </w:r>
           </w:p>
         </w:tc>
@@ -10454,7 +10454,7 @@
                 <w:b w:val="0"/>
                 <w:sz w:val="15"/>
               </w:rPr>
-              <w:t>-0.0156</w:t>
+              <w:t>-0.0467</w:t>
             </w:r>
           </w:p>
         </w:tc>
@@ -10480,7 +10480,7 @@
                 <w:b w:val="0"/>
                 <w:sz w:val="15"/>
               </w:rPr>
-              <w:t>0.0007</w:t>
+              <w:t>0.0000</w:t>
             </w:r>
           </w:p>
         </w:tc>
@@ -10615,7 +10615,7 @@
                 <w:b w:val="0"/>
                 <w:sz w:val="15"/>
               </w:rPr>
-              <w:t>0.0418</w:t>
+              <w:t>0.0332</w:t>
             </w:r>
           </w:p>
         </w:tc>
@@ -10750,7 +10750,7 @@
                 <w:b w:val="0"/>
                 <w:sz w:val="15"/>
               </w:rPr>
-              <w:t>Francisco Guillermo Ochoa Magaña</w:t>
+              <w:t>Hernán Ismael Galíndez</w:t>
             </w:r>
           </w:p>
         </w:tc>
@@ -10776,7 +10776,7 @@
                 <w:b w:val="0"/>
                 <w:sz w:val="15"/>
               </w:rPr>
-              <w:t>Mexico</w:t>
+              <w:t>Ecuador</w:t>
             </w:r>
           </w:p>
         </w:tc>
@@ -10802,7 +10802,7 @@
                 <w:b w:val="0"/>
                 <w:sz w:val="15"/>
               </w:rPr>
-              <w:t>0.0391</w:t>
+              <w:t>0.0322</w:t>
             </w:r>
           </w:p>
         </w:tc>
@@ -10828,7 +10828,7 @@
                 <w:b w:val="0"/>
                 <w:sz w:val="15"/>
               </w:rPr>
-              <w:t>-0.0288</w:t>
+              <w:t>-0.0156</w:t>
             </w:r>
           </w:p>
         </w:tc>
@@ -10854,7 +10854,7 @@
                 <w:b w:val="0"/>
                 <w:sz w:val="15"/>
               </w:rPr>
-              <w:t>0.0151</w:t>
+              <w:t>0.0007</w:t>
             </w:r>
           </w:p>
         </w:tc>
@@ -10937,7 +10937,7 @@
                 <w:b w:val="0"/>
                 <w:sz w:val="15"/>
               </w:rPr>
-              <w:t>Edouard Mendy</w:t>
+              <w:t>Francisco Guillermo Ochoa Magaña</w:t>
             </w:r>
           </w:p>
         </w:tc>
@@ -10963,7 +10963,7 @@
                 <w:b w:val="0"/>
                 <w:sz w:val="15"/>
               </w:rPr>
-              <w:t>Senegal</w:t>
+              <w:t>Mexico</w:t>
             </w:r>
           </w:p>
         </w:tc>
@@ -10989,7 +10989,7 @@
                 <w:b w:val="0"/>
                 <w:sz w:val="15"/>
               </w:rPr>
-              <w:t>0.0240</w:t>
+              <w:t>0.0294</w:t>
             </w:r>
           </w:p>
         </w:tc>
@@ -11015,7 +11015,7 @@
                 <w:b w:val="0"/>
                 <w:sz w:val="15"/>
               </w:rPr>
-              <w:t>-0.0962</w:t>
+              <w:t>-0.0288</w:t>
             </w:r>
           </w:p>
         </w:tc>
@@ -11041,7 +11041,7 @@
                 <w:b w:val="0"/>
                 <w:sz w:val="15"/>
               </w:rPr>
-              <w:t>0.1249</w:t>
+              <w:t>0.0151</w:t>
             </w:r>
           </w:p>
         </w:tc>
@@ -11176,7 +11176,7 @@
                 <w:b w:val="0"/>
                 <w:sz w:val="15"/>
               </w:rPr>
-              <w:t>0.0239</w:t>
+              <w:t>0.0140</w:t>
             </w:r>
           </w:p>
         </w:tc>
@@ -11311,7 +11311,7 @@
                 <w:b w:val="0"/>
                 <w:sz w:val="15"/>
               </w:rPr>
-              <w:t>Yann Sommer</w:t>
+              <w:t>Edouard Mendy</w:t>
             </w:r>
           </w:p>
         </w:tc>
@@ -11337,7 +11337,7 @@
                 <w:b w:val="0"/>
                 <w:sz w:val="15"/>
               </w:rPr>
-              <w:t>Switzerland</w:t>
+              <w:t>Senegal</w:t>
             </w:r>
           </w:p>
         </w:tc>
@@ -11363,7 +11363,7 @@
                 <w:b w:val="0"/>
                 <w:sz w:val="15"/>
               </w:rPr>
-              <w:t>0.0190</w:t>
+              <w:t>0.0133</w:t>
             </w:r>
           </w:p>
         </w:tc>
@@ -11389,7 +11389,7 @@
                 <w:b w:val="0"/>
                 <w:sz w:val="15"/>
               </w:rPr>
-              <w:t>-0.0669</w:t>
+              <w:t>-0.0962</w:t>
             </w:r>
           </w:p>
         </w:tc>
@@ -11415,7 +11415,7 @@
                 <w:b w:val="0"/>
                 <w:sz w:val="15"/>
               </w:rPr>
-              <w:t>0.0198</w:t>
+              <w:t>0.1249</w:t>
             </w:r>
           </w:p>
         </w:tc>
@@ -11498,7 +11498,7 @@
                 <w:b w:val="0"/>
                 <w:sz w:val="15"/>
               </w:rPr>
-              <w:t>Milan Borjan</w:t>
+              <w:t>Yann Sommer</w:t>
             </w:r>
           </w:p>
         </w:tc>
@@ -11524,7 +11524,7 @@
                 <w:b w:val="0"/>
                 <w:sz w:val="15"/>
               </w:rPr>
-              <w:t>Canada</w:t>
+              <w:t>Switzerland</w:t>
             </w:r>
           </w:p>
         </w:tc>
@@ -11550,7 +11550,7 @@
                 <w:b w:val="0"/>
                 <w:sz w:val="15"/>
               </w:rPr>
-              <w:t>0.0141</w:t>
+              <w:t>0.0091</w:t>
             </w:r>
           </w:p>
         </w:tc>
@@ -11576,7 +11576,7 @@
                 <w:b w:val="0"/>
                 <w:sz w:val="15"/>
               </w:rPr>
-              <w:t>-0.0637</w:t>
+              <w:t>-0.0669</w:t>
             </w:r>
           </w:p>
         </w:tc>
@@ -11602,7 +11602,7 @@
                 <w:b w:val="0"/>
                 <w:sz w:val="15"/>
               </w:rPr>
-              <w:t>0.0173</w:t>
+              <w:t>0.0198</w:t>
             </w:r>
           </w:p>
         </w:tc>
@@ -11685,7 +11685,7 @@
                 <w:b w:val="0"/>
                 <w:sz w:val="15"/>
               </w:rPr>
-              <w:t>Seung-Gyu Kim</w:t>
+              <w:t>Milan Borjan</w:t>
             </w:r>
           </w:p>
         </w:tc>
@@ -11711,7 +11711,7 @@
                 <w:b w:val="0"/>
                 <w:sz w:val="15"/>
               </w:rPr>
-              <w:t>South Korea</w:t>
+              <w:t>Canada</w:t>
             </w:r>
           </w:p>
         </w:tc>
@@ -11737,7 +11737,7 @@
                 <w:b w:val="0"/>
                 <w:sz w:val="15"/>
               </w:rPr>
-              <w:t>0.0109</w:t>
+              <w:t>0.0042</w:t>
             </w:r>
           </w:p>
         </w:tc>
@@ -11763,7 +11763,7 @@
                 <w:b w:val="0"/>
                 <w:sz w:val="15"/>
               </w:rPr>
-              <w:t>-0.0379</w:t>
+              <w:t>-0.0637</w:t>
             </w:r>
           </w:p>
         </w:tc>
@@ -11789,7 +11789,7 @@
                 <w:b w:val="0"/>
                 <w:sz w:val="15"/>
               </w:rPr>
-              <w:t>0.0139</w:t>
+              <w:t>0.0173</w:t>
             </w:r>
           </w:p>
         </w:tc>
@@ -11872,7 +11872,7 @@
                 <w:b w:val="0"/>
                 <w:sz w:val="15"/>
               </w:rPr>
-              <w:t>Alisson Ramsés Becker</w:t>
+              <w:t>Seung-Gyu Kim</w:t>
             </w:r>
           </w:p>
         </w:tc>
@@ -11898,7 +11898,7 @@
                 <w:b w:val="0"/>
                 <w:sz w:val="15"/>
               </w:rPr>
-              <w:t>Brazil</w:t>
+              <w:t>South Korea</w:t>
             </w:r>
           </w:p>
         </w:tc>
@@ -11950,7 +11950,7 @@
                 <w:b w:val="0"/>
                 <w:sz w:val="15"/>
               </w:rPr>
-              <w:t>-0.0427</w:t>
+              <w:t>-0.0379</w:t>
             </w:r>
           </w:p>
         </w:tc>
@@ -11976,7 +11976,7 @@
                 <w:b w:val="0"/>
                 <w:sz w:val="15"/>
               </w:rPr>
-              <w:t>0.0060</w:t>
+              <w:t>0.0139</w:t>
             </w:r>
           </w:p>
         </w:tc>
@@ -12026,7 +12026,7 @@
         <w:widowControl/>
       </w:pPr>
       <w:r>
-        <w:t>The selected preregistered weights are 45% PSxG shot prevention, 25% clutch save residual, 5% regular-penalty impact, 20% shootout win probability added, and 5% support value. The state-leverage channel received zero selected weight. Ordinary saves are counted once in PSxG; clutch adds only multiplier-minus-one residual on qualifying late saves. All twelve hard promotion gates passed. Damián Emiliano Martínez ranks 3rd, Dominik Livaković 1st, Yassine Bounou 4th, Wojciech Szczęsny 6th, Matthew Turner 8th, and Mohammed Al Owais 11th.</w:t>
+        <w:t>The selected preregistered weights are 45% PSxG shot prevention, 25% clutch save residual, 5% regular-penalty impact, 20% shootout win probability added, and 5% support value. The state-leverage channel received zero selected weight. Ordinary saves are counted once in PSxG; clutch adds only multiplier-minus-one residual on qualifying late saves. A cohort-wide defensive-shield correction limits downside confidence for keepers with at least 360 minutes and sustained below-median expected threat faced per 90. It does not boost positive evidence or alter penalty, shootout, or support channels. All twelve hard promotion gates passed. Damián Emiliano Martínez ranks 3rd, Dominik Livaković 1st, Yassine Bounou 4th, Wojciech Szczęsny 6th, Matthew Turner 8th, and Mohammed Al Owais 11th.</w:t>
       </w:r>
     </w:p>
     <w:p>
@@ -12034,7 +12034,7 @@
         <w:widowControl/>
       </w:pPr>
       <w:r>
-        <w:t>The scorer consumes no player identity, team advancement, awards, reputation, pedigree, or named-opponent feature. Historical v3/v4 columns and files remain frozen for reproducibility, but they are not alternative active rankings.</w:t>
+        <w:t>The scorer consumes no player identity, team advancement, awards, reputation, pedigree, or named-opponent feature. Legacy comparison columns in the master dataset are not alternative active rankings.</w:t>
       </w:r>
     </w:p>
     <w:sectPr>

</xml_diff>